<commit_message>
feat(rgpd): aligne l'export SAR sur l'enonce J3-bis (route GET + bouton + email)
Corrige 3 ecarts vs l'enonce officiel J3-bis (demandeur : M. Hugo Petit, Art. 15) :
- Endpoint canonique GET /api/accounts/me/export/ (?fmt=json|zip). Le POST
  /data-export et l'historique GET sont conserves (compat). Param `fmt` (et non
  `format`, reserve par DRF pour la negociation de renderer -> 404).
- Bouton frontend « Exporter mes donnees » (JSON/ZIP) dans Mon profil -> Mes
  donnees (exportMyData -> telechargement blob).
- Reponse ecrite pro a M. Hugo Petit (accuse, lien, 6 categories, droits
  Art. 16/17/18/20) : docs/perturbations/j3bis-reponse-hugo-petit.md.
- Export complete a 6 categories (ajout « signalements », liste vide).
- Refactor : _perform_export partage POST/GET + tests GET (17 tests accounts).
- j3bis-rgpd.md realigne (scenario Hugo Petit, route, bouton, criteres).
</commit_message>
<xml_diff>
--- a/docs/perturbations/equipe-6-j3bis-rgpd.docx
+++ b/docs/perturbations/equipe-6-j3bis-rgpd.docx
@@ -390,25 +390,67 @@
     </w:p>
     <w:p>
       <w:r>
-        <w:t xml:space="preserve">Un utilisateur exerce ses droits RGPD : </w:t>
+        <w:rPr>
+          <w:b/>
+        </w:rPr>
+        <w:t>M. Hugo Petit</w:t>
+      </w:r>
+      <w:r>
+        <w:t xml:space="preserve"> (étudiant M2 Droit numérique) soumet le </w:t>
       </w:r>
       <w:r>
         <w:rPr>
           <w:b/>
         </w:rPr>
-        <w:t>« Quelles données avez-vous sur moi, et rendez-les moi dans un format réutilisable »</w:t>
+        <w:t>mercredi 10h30</w:t>
       </w:r>
       <w:r>
-        <w:t xml:space="preserve"> (droit d'accès — art. 15 — et à la portabilité — art. 20). En parallèle, le sponsor rappelle l'obligation d'afficher les </w:t>
+        <w:t xml:space="preserve">, en pleine livraison MVP, une </w:t>
       </w:r>
       <w:r>
         <w:rPr>
           <w:b/>
         </w:rPr>
-        <w:t>mentions légales, CGU, politique de confidentialité et cookies</w:t>
+        <w:t>demande formelle d'accès</w:t>
       </w:r>
       <w:r>
-        <w:t xml:space="preserve">. Il faut une réponse </w:t>
+        <w:t xml:space="preserve"> (RGPD </w:t>
+      </w:r>
+      <w:r>
+        <w:rPr>
+          <w:b/>
+        </w:rPr>
+        <w:t>Art. 15</w:t>
+      </w:r>
+      <w:r>
+        <w:t xml:space="preserve">) : il réclame l'export complet de ses données (compte, cours/textes, quiz, réponses et scores, signalements, logs d'audit) en </w:t>
+      </w:r>
+      <w:r>
+        <w:rPr>
+          <w:b/>
+        </w:rPr>
+        <w:t>format structuré (JSON ou CSV)</w:t>
+      </w:r>
+      <w:r>
+        <w:t xml:space="preserve">, avec un </w:t>
+      </w:r>
+      <w:r>
+        <w:rPr>
+          <w:b/>
+        </w:rPr>
+        <w:t>délai de réponse de 48 h</w:t>
+      </w:r>
+      <w:r>
+        <w:t xml:space="preserve">. En parallèle, l'obligation d'afficher les </w:t>
+      </w:r>
+      <w:r>
+        <w:rPr>
+          <w:b/>
+        </w:rPr>
+        <w:t>mentions légales, CGU, confidentialité et cookies</w:t>
+      </w:r>
+      <w:r>
+        <w:t xml:space="preserve"> s'applique. Il faut une réponse </w:t>
       </w:r>
       <w:r>
         <w:rPr>
@@ -417,7 +459,7 @@
         <w:t>outillée</w:t>
       </w:r>
       <w:r>
-        <w:t xml:space="preserve"> (pas un email manuel) avant la Release 1.</w:t>
+        <w:t xml:space="preserve"> (pas un traitement manuel).</w:t>
       </w:r>
     </w:p>
     <w:p>
@@ -432,6 +474,37 @@
           <w:i/>
         </w:rPr>
         <w:t>« Tout utilisateur doit pouvoir, en un clic, télécharger l'intégralité de ses données personnelles dans un format lisible par machine, et consulter les pages légales du service. »</w:t>
+      </w:r>
+    </w:p>
+    <w:p>
+      <w:pPr>
+        <w:ind w:left="454"/>
+      </w:pPr>
+    </w:p>
+    <w:p>
+      <w:pPr>
+        <w:ind w:left="454"/>
+      </w:pPr>
+      <w:r>
+        <w:t xml:space="preserve">Nature de la perturbation : </w:t>
+      </w:r>
+      <w:r>
+        <w:rPr>
+          <w:b/>
+        </w:rPr>
+        <w:t>arbitrage documentaire</w:t>
+      </w:r>
+      <w:r>
+        <w:t xml:space="preserve"> (priorisation, registre de traitement) plus qu'un sprint de code. Livrables : endpoint + bouton + politique de rétention + audit trail + </w:t>
+      </w:r>
+      <w:r>
+        <w:rPr>
+          <w:b/>
+        </w:rPr>
+        <w:t>réponse écrite</w:t>
+      </w:r>
+      <w:r>
+        <w:t xml:space="preserve"> au demandeur.</w:t>
       </w:r>
     </w:p>
     <w:p>
@@ -864,7 +937,7 @@
         <w:pStyle w:val="Heading1"/>
       </w:pPr>
       <w:r>
-        <w:t>3. API livrée *(CA-J3bis-2)*</w:t>
+        <w:t>3. API + IHM livrées *(CA-J3bis-2)*</w:t>
       </w:r>
     </w:p>
     <w:tbl>
@@ -934,7 +1007,7 @@
               <w:rPr>
                 <w:rFonts w:ascii="Consolas" w:hAnsi="Consolas"/>
               </w:rPr>
-              <w:t>POST</w:t>
+              <w:t>GET</w:t>
             </w:r>
           </w:p>
         </w:tc>
@@ -946,9 +1019,9 @@
             <w:r/>
             <w:r>
               <w:rPr>
-                <w:rFonts w:ascii="Consolas" w:hAnsi="Consolas"/>
+                <w:b/>
               </w:rPr>
-              <w:t>/api/accounts/data-export/</w:t>
+              <w:t>`/api/accounts/me/export/`</w:t>
             </w:r>
           </w:p>
         </w:tc>
@@ -959,7 +1032,13 @@
           <w:p>
             <w:r/>
             <w:r>
-              <w:t xml:space="preserve">Génère et </w:t>
+              <w:rPr>
+                <w:b/>
+              </w:rPr>
+              <w:t>Endpoint canonique</w:t>
+            </w:r>
+            <w:r>
+              <w:t xml:space="preserve"> (énoncé J3-bis) : génère et </w:t>
             </w:r>
             <w:r>
               <w:rPr>
@@ -974,7 +1053,7 @@
               <w:rPr>
                 <w:rFonts w:ascii="Consolas" w:hAnsi="Consolas"/>
               </w:rPr>
-              <w:t>?format=json</w:t>
+              <w:t>?fmt=json</w:t>
             </w:r>
             <w:r>
               <w:t xml:space="preserve"> ou </w:t>
@@ -1059,8 +1138,119 @@
           </w:p>
         </w:tc>
       </w:tr>
+      <w:tr>
+        <w:tc>
+          <w:tcPr>
+            <w:tcW w:type="dxa" w:w="2880"/>
+          </w:tcPr>
+          <w:p>
+            <w:r/>
+            <w:r>
+              <w:rPr>
+                <w:rFonts w:ascii="Consolas" w:hAnsi="Consolas"/>
+              </w:rPr>
+              <w:t>POST</w:t>
+            </w:r>
+          </w:p>
+        </w:tc>
+        <w:tc>
+          <w:tcPr>
+            <w:tcW w:type="dxa" w:w="2880"/>
+          </w:tcPr>
+          <w:p>
+            <w:r/>
+            <w:r>
+              <w:rPr>
+                <w:rFonts w:ascii="Consolas" w:hAnsi="Consolas"/>
+              </w:rPr>
+              <w:t>/api/accounts/data-export/</w:t>
+            </w:r>
+          </w:p>
+        </w:tc>
+        <w:tc>
+          <w:tcPr>
+            <w:tcW w:type="dxa" w:w="2880"/>
+          </w:tcPr>
+          <w:p>
+            <w:r/>
+            <w:r>
+              <w:t>Variante génération/téléchargement (compat).</w:t>
+            </w:r>
+          </w:p>
+        </w:tc>
+      </w:tr>
     </w:tbl>
     <w:p/>
+    <w:p>
+      <w:pPr>
+        <w:pStyle w:val="ListBullet"/>
+      </w:pPr>
+      <w:r>
+        <w:rPr>
+          <w:b/>
+        </w:rPr>
+        <w:t>Bouton frontend</w:t>
+      </w:r>
+      <w:r>
+        <w:t xml:space="preserve"> : </w:t>
+      </w:r>
+      <w:r>
+        <w:rPr>
+          <w:i/>
+        </w:rPr>
+        <w:t xml:space="preserve">Mon profil → Mes données → </w:t>
+      </w:r>
+      <w:r>
+        <w:rPr>
+          <w:i/>
+        </w:rPr>
+        <w:t>« Exporter mes données (JSON) »</w:t>
+      </w:r>
+      <w:r>
+        <w:t xml:space="preserve">** (+ ZIP) — </w:t>
+      </w:r>
+      <w:r>
+        <w:rPr>
+          <w:rFonts w:ascii="Consolas" w:hAnsi="Consolas"/>
+        </w:rPr>
+        <w:t>ProfilePage.tsx</w:t>
+      </w:r>
+      <w:r>
+        <w:t xml:space="preserve"> via </w:t>
+      </w:r>
+      <w:r>
+        <w:rPr>
+          <w:rFonts w:ascii="Consolas" w:hAnsi="Consolas"/>
+        </w:rPr>
+        <w:t>exportMyData</w:t>
+      </w:r>
+      <w:r>
+        <w:t>.</w:t>
+      </w:r>
+    </w:p>
+    <w:p>
+      <w:pPr>
+        <w:pStyle w:val="ListBullet"/>
+      </w:pPr>
+      <w:r>
+        <w:rPr>
+          <w:b/>
+        </w:rPr>
+        <w:t>6 catégories</w:t>
+      </w:r>
+      <w:r>
+        <w:t xml:space="preserve"> exportées : compte, quiz (cours + questions), réponses, </w:t>
+      </w:r>
+      <w:r>
+        <w:rPr>
+          <w:b/>
+        </w:rPr>
+        <w:t>signalements</w:t>
+      </w:r>
+      <w:r>
+        <w:t>, demandes d'accès, journal d'audit.</w:t>
+      </w:r>
+    </w:p>
     <w:p>
       <w:pPr>
         <w:pStyle w:val="ListBullet"/>
@@ -1087,7 +1277,7 @@
         <w:rPr>
           <w:rFonts w:ascii="Consolas" w:hAnsi="Consolas"/>
         </w:rPr>
-        <w:t>test_data_export_requires_auth</w:t>
+        <w:t>test_me_export_requires_auth</w:t>
       </w:r>
       <w:r>
         <w:t>).</w:t>
@@ -1195,6 +1385,20 @@
     </w:p>
     <w:p>
       <w:pPr>
+        <w:pStyle w:val="ListBullet"/>
+      </w:pPr>
+      <w:r>
+        <w:rPr>
+          <w:b/>
+        </w:rPr>
+        <w:t>Réponse écrite</w:t>
+      </w:r>
+      <w:r>
+        <w:t xml:space="preserve"> au demandeur : réponse à M. Hugo Petit.</w:t>
+      </w:r>
+    </w:p>
+    <w:p>
+      <w:pPr>
         <w:pStyle w:val="Heading1"/>
       </w:pPr>
       <w:r>
@@ -1215,16 +1419,16 @@
         <w:t>CA-J3bis-1</w:t>
       </w:r>
       <w:r>
-        <w:t xml:space="preserve"> — Export </w:t>
+        <w:t xml:space="preserve"> — Endpoint </w:t>
       </w:r>
       <w:r>
         <w:rPr>
           <w:b/>
         </w:rPr>
-        <w:t>complet</w:t>
+        <w:t>`GET /api/accounts/me/export/`</w:t>
       </w:r>
       <w:r>
-        <w:t xml:space="preserve"> des données perso (compte, quiz, réponses) → §2</w:t>
+        <w:t xml:space="preserve"> → 200 + données structurées → §3</w:t>
       </w:r>
     </w:p>
     <w:p>
@@ -1241,16 +1445,16 @@
         <w:t>CA-J3bis-2</w:t>
       </w:r>
       <w:r>
-        <w:t xml:space="preserve"> — Format </w:t>
+        <w:t xml:space="preserve"> — Export </w:t>
       </w:r>
       <w:r>
         <w:rPr>
           <w:b/>
         </w:rPr>
-        <w:t>lisible par machine</w:t>
+        <w:t>complet 6 catégories</w:t>
       </w:r>
       <w:r>
-        <w:t xml:space="preserve"> (JSON/ZIP), téléchargeable → §3</w:t>
+        <w:t xml:space="preserve"> (compte, quiz, réponses, signalements, demandes, audit) → §2/§3</w:t>
       </w:r>
     </w:p>
     <w:p>
@@ -1273,16 +1477,10 @@
         <w:rPr>
           <w:b/>
         </w:rPr>
-        <w:t>Isolation</w:t>
+        <w:t>≥ 2 formats</w:t>
       </w:r>
       <w:r>
-        <w:t xml:space="preserve"> stricte : aucune donnée d'un autre utilisateur → </w:t>
-      </w:r>
-      <w:r>
-        <w:rPr>
-          <w:rFonts w:ascii="Consolas" w:hAnsi="Consolas"/>
-        </w:rPr>
-        <w:t>test_data_export_isolates_other_users</w:t>
+        <w:t xml:space="preserve"> (JSON + ZIP), lisibles par machine → §3</w:t>
       </w:r>
     </w:p>
     <w:p>
@@ -1299,16 +1497,22 @@
         <w:t>CA-J3bis-4</w:t>
       </w:r>
       <w:r>
-        <w:t xml:space="preserve"> — Demande </w:t>
+        <w:t xml:space="preserve"> — </w:t>
       </w:r>
       <w:r>
         <w:rPr>
           <w:b/>
         </w:rPr>
-        <w:t>tracée</w:t>
+        <w:t>Bouton frontend</w:t>
       </w:r>
       <w:r>
-        <w:t xml:space="preserve"> (DataRequest) + audit (AuditEvent) → §2/§3</w:t>
+        <w:t xml:space="preserve"> « Exporter mes données » (profil authentifié) → </w:t>
+      </w:r>
+      <w:r>
+        <w:rPr>
+          <w:rFonts w:ascii="Consolas" w:hAnsi="Consolas"/>
+        </w:rPr>
+        <w:t>ProfilePage.tsx</w:t>
       </w:r>
     </w:p>
     <w:p>
@@ -1325,22 +1529,16 @@
         <w:t>CA-J3bis-5</w:t>
       </w:r>
       <w:r>
-        <w:t xml:space="preserve"> — Accès </w:t>
+        <w:t xml:space="preserve"> — </w:t>
       </w:r>
       <w:r>
         <w:rPr>
           <w:b/>
         </w:rPr>
-        <w:t>authentifié</w:t>
+        <w:t>Politique de rétention</w:t>
       </w:r>
       <w:r>
-        <w:t xml:space="preserve"> uniquement → </w:t>
-      </w:r>
-      <w:r>
-        <w:rPr>
-          <w:rFonts w:ascii="Consolas" w:hAnsi="Consolas"/>
-        </w:rPr>
-        <w:t>test_data_export_requires_auth</w:t>
+        <w:t xml:space="preserve"> écrite (≥ 3 sections) → politique de rétention</w:t>
       </w:r>
     </w:p>
     <w:p>
@@ -1363,16 +1561,25 @@
         <w:rPr>
           <w:b/>
         </w:rPr>
-        <w:t>Pages légales</w:t>
+        <w:t>Audit trail</w:t>
       </w:r>
       <w:r>
-        <w:t xml:space="preserve"> en ligne (mentions, CGU, confidentialité, cookies) → </w:t>
+        <w:t xml:space="preserve"> </w:t>
       </w:r>
       <w:r>
         <w:rPr>
           <w:rFonts w:ascii="Consolas" w:hAnsi="Consolas"/>
         </w:rPr>
-        <w:t>frontend/src/pages/legal/</w:t>
+        <w:t>DataRequest</w:t>
+      </w:r>
+      <w:r>
+        <w:t xml:space="preserve"> en base (qui, quand, statut, hash) → </w:t>
+      </w:r>
+      <w:r>
+        <w:rPr>
+          <w:rFonts w:ascii="Consolas" w:hAnsi="Consolas"/>
+        </w:rPr>
+        <w:t>models.py</w:t>
       </w:r>
     </w:p>
     <w:p>
@@ -1389,13 +1596,39 @@
         <w:t>CA-J3bis-7</w:t>
       </w:r>
       <w:r>
-        <w:t xml:space="preserve"> — Tests automatisés (6) en CI → </w:t>
+        <w:t xml:space="preserve"> — </w:t>
+      </w:r>
+      <w:r>
+        <w:rPr>
+          <w:b/>
+        </w:rPr>
+        <w:t>Réponse professionnelle</w:t>
+      </w:r>
+      <w:r>
+        <w:t xml:space="preserve"> au demandeur (M. Hugo Petit) → email</w:t>
+      </w:r>
+    </w:p>
+    <w:p>
+      <w:pPr>
+        <w:pStyle w:val="ListBullet"/>
+      </w:pPr>
+      <w:r>
+        <w:t xml:space="preserve">[x] </w:t>
+      </w:r>
+      <w:r>
+        <w:rPr>
+          <w:i/>
+        </w:rPr>
+        <w:t>Bonus</w:t>
+      </w:r>
+      <w:r>
+        <w:t xml:space="preserve"> — Isolation inter-comptes + accès authentifié + pages légales → tests + </w:t>
       </w:r>
       <w:r>
         <w:rPr>
           <w:rFonts w:ascii="Consolas" w:hAnsi="Consolas"/>
         </w:rPr>
-        <w:t>accounts/tests.py</w:t>
+        <w:t>frontend/src/pages/legal/</w:t>
       </w:r>
     </w:p>
     <w:p>

</xml_diff>